<commit_message>
Quitar textos que describen los cambios respecto de la versión anterior
Co-Authored-By: Claude Opus 5.5 <noreply@anthropic.com>
Claude-Session: https://claude.ai/code/session_01A8vvz3ohxXvNDea3qzDphw
</commit_message>
<xml_diff>
--- a/ASI_Etapa3_Grupo112.docx
+++ b/ASI_Etapa3_Grupo112.docx
@@ -1324,7 +1324,7 @@
               </w:rPr>
               <w:t xml:space="preserve">Diseñar el Layout de el/los sector/es involucrados en el proceso crítico afectado/s en el proyecto.</w:t>
               <w:tab/>
-              <w:t xml:space="preserve">27</w:t>
+              <w:t xml:space="preserve">26</w:t>
             </w:r>
           </w:hyperlink>
           <w:r>
@@ -1480,7 +1480,7 @@
               </w:rPr>
               <w:t xml:space="preserve">Forma de Adquisición de los Activos</w:t>
               <w:tab/>
-              <w:t xml:space="preserve">31</w:t>
+              <w:t xml:space="preserve">30</w:t>
             </w:r>
           </w:hyperlink>
           <w:r>
@@ -1532,7 +1532,7 @@
               </w:rPr>
               <w:t xml:space="preserve">Indicar cuál es la diferencia entre RFI y RFP, justificar cuando utilizarían cada uno de ellos en el proyecto de TI elegido</w:t>
               <w:tab/>
-              <w:t xml:space="preserve">33</w:t>
+              <w:t xml:space="preserve">32</w:t>
             </w:r>
           </w:hyperlink>
           <w:r>
@@ -1584,7 +1584,7 @@
               </w:rPr>
               <w:t xml:space="preserve">Asignar recursos a la estructura de desglose de trabajo realizada y realizar la estimación de tiempos. Desarrollar los diagramas de Red y de Gantt. Utilizar este último para indicar la cantidad de RRHH y el perfil requerido para el proyecto (aplanar los recursos). Estimar la duración del Proyecto.</w:t>
               <w:tab/>
-              <w:t xml:space="preserve">34</w:t>
+              <w:t xml:space="preserve">33</w:t>
             </w:r>
           </w:hyperlink>
           <w:r>
@@ -1636,7 +1636,7 @@
               </w:rPr>
               <w:t xml:space="preserve">Indicar cuáles variables se tendrán en cuenta para calcular los costos del proyecto</w:t>
               <w:tab/>
-              <w:t xml:space="preserve">35</w:t>
+              <w:t xml:space="preserve">34</w:t>
             </w:r>
           </w:hyperlink>
           <w:r>
@@ -1688,7 +1688,7 @@
               </w:rPr>
               <w:t xml:space="preserve">Analizar la factibilidad técnica, económica y legal del Proyecto.</w:t>
               <w:tab/>
-              <w:t xml:space="preserve">36</w:t>
+              <w:t xml:space="preserve">35</w:t>
             </w:r>
           </w:hyperlink>
           <w:r>
@@ -1740,7 +1740,7 @@
               </w:rPr>
               <w:t xml:space="preserve">Historial de versiones</w:t>
               <w:tab/>
-              <w:t xml:space="preserve">37</w:t>
+              <w:t xml:space="preserve">36</w:t>
             </w:r>
           </w:hyperlink>
           <w:r>
@@ -5024,7 +5024,7 @@
           <w:szCs w:val="24"/>
           <w:rtl w:val="0"/>
         </w:rPr>
-        <w:t xml:space="preserve">A continuación se presenta la EDT corregida (archivo EDTCom401Grupo112.xlsx). Respecto de la versión anterior se agregaron la negociación y firma del contrato y la compra del software SGDD MapaDoc (tareas 14 y 15), la definición del tiempo de guardado de las historias clínicas (tarea 48) y las pruebas de almacenamiento según el peso de los archivos, ABM del SGDD y de la app, guardado y respaldo, y búsqueda (tareas 53 a 57).</w:t>
+        <w:t xml:space="preserve">A continuación se presenta la EDT del proyecto (archivo EDTCom401Grupo112.xlsx):</w:t>
       </w:r>
     </w:p>
     <w:p>
@@ -18766,7 +18766,7 @@
           <w:szCs w:val="24"/>
           <w:rtl w:val="0"/>
         </w:rPr>
-        <w:t xml:space="preserve">Se presenta el acta del proyecto corregida (archivo ACTA_DEL_PROYECTO_Grupo112.docx):</w:t>
+        <w:t xml:space="preserve">Se presenta el acta del proyecto (archivo ACTA_DEL_PROYECTO_Grupo112.docx):</w:t>
       </w:r>
     </w:p>
     <w:p>
@@ -29669,36 +29669,6 @@
           <w:rtl w:val="0"/>
         </w:rPr>
         <w:t xml:space="preserve">El diagrama de gantt se encuentra adjunto tanto en un archivo .gan como un archivo .pdf. Al visualizarlo con su correspondiente programa se puede visualizar el diagrama de red generado automáticamente. Para su confección se utilizó GanttProject. Para ver el diagrama de red se debe abrir el proyecto y hacer click en Ver &gt; Diagrama PERT. </w:t>
-      </w:r>
-    </w:p>
-    <w:p>
-      <w:pPr>
-        <w:rPr>
-          <w:sz w:val="24"/>
-          <w:szCs w:val="24"/>
-        </w:rPr>
-      </w:pPr>
-      <w:r>
-        <w:rPr>
-          <w:rtl w:val="0"/>
-        </w:rPr>
-      </w:r>
-    </w:p>
-    <w:p>
-      <w:pPr>
-        <w:ind w:left="0" w:firstLine="720"/>
-        <w:rPr>
-          <w:sz w:val="24"/>
-          <w:szCs w:val="24"/>
-        </w:rPr>
-      </w:pPr>
-      <w:r>
-        <w:rPr>
-          <w:sz w:val="24"/>
-          <w:szCs w:val="24"/>
-          <w:rtl w:val="0"/>
-        </w:rPr>
-        <w:t xml:space="preserve">Corrección del cronograma: en la versión anterior la fase de Capacitación se extendía 59 días (del 25/09/2025 al 19/12/2025), porque la definición del entrenador dependía de la aprobación del proyecto. Ahora se define al entrenador una vez otorgadas las claves de acceso, y el material y el dictado se reducen de 5 a 2 días cada uno, por lo que la capacitación pasa a ser una de las fases más cortas: 6 días hábiles, del 03/12/2025 al 11/12/2025. También se incorporaron las tareas nuevas de la EDT (compra del SW SGDD, tiempo de guardado y nuevas pruebas); la recepción del software pasa de 20 a 15 días porque el plazo del proveedor se cuenta desde la compra. La duración total del proyecto no cambia: del 29/08/2025 al 05/01/2026. Los archivos corregidos son GanttCom401Grupo112.gan, GanttCom401Grupo112.pdf y DiagramaRedCom401Grupo112.pdf.</w:t>
       </w:r>
     </w:p>
     <w:p>

</xml_diff>

<commit_message>
Apuntar los links del documento a los archivos nuevos en Drive
Co-Authored-By: Claude Opus 5.5 <noreply@anthropic.com>
Claude-Session: https://claude.ai/code/session_01A8vvz3ohxXvNDea3qzDphw
</commit_message>
<xml_diff>
--- a/ASI_Etapa3_Grupo112.docx
+++ b/ASI_Etapa3_Grupo112.docx
@@ -18716,7 +18716,7 @@
             <w:u w:val="single"/>
             <w:rtl w:val="0"/>
           </w:rPr>
-          <w:t xml:space="preserve">https://docs.google.com/spreadsheets/d/1y0SGAMuu5T8OQRjedUotwltTPcqTkL5EeqCTTwo-H-M/edit?usp=sharing</w:t>
+          <w:t xml:space="preserve">https://docs.google.com/spreadsheets/d/1od5M843PEHjNY-YPwxJ4yB2hXNthiK6t/edit?usp=sharing</w:t>
         </w:r>
       </w:hyperlink>
       <w:r>
@@ -20113,7 +20113,7 @@
             <w:u w:val="single"/>
             <w:rtl w:val="0"/>
           </w:rPr>
-          <w:t xml:space="preserve">https://docs.google.com/document/d/1BXy7B8blSmJVf41FK4Z6zWK9hTZl-GoywwSExGAZi3o/edit?usp=sharing</w:t>
+          <w:t xml:space="preserve">https://docs.google.com/document/d/1lnA8UVJQdHGbRKmLIX3r1D0DLcaU9i06/edit?usp=sharing</w:t>
         </w:r>
       </w:hyperlink>
       <w:r>
@@ -29812,7 +29812,7 @@
             <w:u w:val="single"/>
             <w:rtl w:val="0"/>
           </w:rPr>
-          <w:t xml:space="preserve">https://drive.google.com/file/d/1yDkgiAZpLBXkA4n7d22wTOsrCC0BnVBL/view?usp=sharing</w:t>
+          <w:t xml:space="preserve">https://drive.google.com/file/d/1TZDSbf5n9bOQ9UYSRrQCsYjevMsmXuSb/view?usp=sharing</w:t>
         </w:r>
       </w:hyperlink>
       <w:r>
@@ -29869,7 +29869,7 @@
             <w:u w:val="single"/>
             <w:rtl w:val="0"/>
           </w:rPr>
-          <w:t xml:space="preserve">https://drive.google.com/file/d/174VrN3Z2HPYZAZdeYsxGad5wqdmZufip/view?usp=sharing</w:t>
+          <w:t xml:space="preserve">https://drive.google.com/file/d/17aCPrAqgr699cdSn4720Vjj_6Oy8J-nI/view?usp=sharing</w:t>
         </w:r>
       </w:hyperlink>
       <w:r>

</xml_diff>